<commit_message>
docs: add reserved DOI to report
</commit_message>
<xml_diff>
--- a/report/Dyness_BMS_Balancing_Algorithm_Charge_Control_Firmware_2.50-71.10.11.docx
+++ b/report/Dyness_BMS_Balancing_Algorithm_Charge_Control_Firmware_2.50-71.10.11.docx
@@ -50,6 +50,20 @@
           <w:sz w:val="20"/>
         </w:rPr>
         <w:t>Experimental report - 9 August 2026</w:t>
+      </w:r>
+    </w:p>
+    <w:p>
+      <w:pPr>
+        <w:spacing w:before="80"/>
+        <w:jc w:val="center"/>
+      </w:pPr>
+      <w:r/>
+      <w:r>
+        <w:rPr>
+          <w:color w:val="595959"/>
+          <w:sz w:val="20"/>
+        </w:rPr>
+        <w:t>Reserved DOI: 10.5281/zenodo.21860970</w:t>
       </w:r>
     </w:p>
     <w:p>

</xml_diff>

<commit_message>
docs: identify tested Powerbrick battery
</commit_message>
<xml_diff>
--- a/report/Dyness_BMS_Balancing_Algorithm_Charge_Control_Firmware_2.50-71.10.11.docx
+++ b/report/Dyness_BMS_Balancing_Algorithm_Charge_Control_Firmware_2.50-71.10.11.docx
@@ -8,7 +8,7 @@
         <w:jc w:val="center"/>
       </w:pPr>
       <w:r>
-        <w:t>Observed Dyness BMS Balancing</w:t>
+        <w:t>Observed Dyness Powerbrick Pro 14.3 kWh BMS</w:t>
         <w:br/>
         <w:t>and Charge-Control Behaviour</w:t>
       </w:r>
@@ -18,10 +18,6 @@
         <w:jc w:val="center"/>
       </w:pPr>
       <w:r>
-        <w:rPr>
-          <w:color w:val="595959"/>
-          <w:sz w:val="24"/>
-        </w:rPr>
         <w:t>Experimental characterization of passive balancing, full-charge detection, CCL control and charge-MOSFET protection</w:t>
       </w:r>
     </w:p>
@@ -122,7 +118,7 @@
     </w:p>
     <w:p>
       <w:r>
-        <w:t xml:space="preserve">A 16-cell Dyness battery BMS running software version 2.50-71.10.11 was experimentally investigated using continuous telemetry of individual cell voltages, battery current, state of charge (SOC), charge-current limit (CCL), charge-permission status, raw status bytes and BMS temperature. Cells 1-15 are transmitted directly; cell 16 is reconstructed in the recorded CSV from pack voltage and the sum of cells 1-15. </w:t>
+        <w:t xml:space="preserve">A Dyness Powerbrick Pro 14.3 kWh battery with a 16-cell BMS running software version 2.50-71.10.11 was experimentally investigated using continuous telemetry of individual cell voltages, battery current, state of charge (SOC), charge-current limit (CCL), charge-permission status, raw status bytes and BMS temperature. Cells 1-15 are transmitted directly; cell 16 is reconstructed in the recorded CSV from pack voltage and the sum of cells 1-15. </w:t>
       </w:r>
       <w:r>
         <w:t xml:space="preserve">The measurements reveal three largely independent control layers: passive balancing, communication-level charge control through CCL, and physical cell-overvoltage protection through the charge MOSFET. </w:t>

</xml_diff>

<commit_message>
fix: correct charge MOSFET discharge recovery
Model recovery on discharge detection after OVP and remove the
unsupported Vmax < 3.5 V trigger from the report, UML diagram and
publication metadata.
</commit_message>
<xml_diff>
--- a/report/Dyness_BMS_Balancing_Algorithm_Charge_Control_Firmware_2.50-71.10.11.docx
+++ b/report/Dyness_BMS_Balancing_Algorithm_Charge_Control_Firmware_2.50-71.10.11.docx
@@ -118,13 +118,7 @@
     </w:p>
     <w:p>
       <w:r>
-        <w:t xml:space="preserve">A Dyness Powerbrick Pro 14.3 kWh battery with a 16-cell BMS running software version 2.50-71.10.11 was experimentally investigated using continuous telemetry of individual cell voltages, battery current, state of charge (SOC), charge-current limit (CCL), charge-permission status, raw status bytes and BMS temperature. Cells 1-15 are transmitted directly; cell 16 is reconstructed in the recorded CSV from pack voltage and the sum of cells 1-15. </w:t>
-      </w:r>
-      <w:r>
-        <w:t xml:space="preserve">The measurements reveal three largely independent control layers: passive balancing, communication-level charge control through CCL, and physical cell-overvoltage protection through the charge MOSFET. </w:t>
-      </w:r>
-      <w:r>
-        <w:t>Passive balancing is globally gated by battery charge current and individual balancing resistors are selected relative to the minimum cell voltage. The BMS declares the battery full when the highest cell reaches 3.5 V, whereupon SOC becomes 100%, CCL becomes 0 A and Charge Enabled becomes false, while the charge MOSFET remains on. If current nevertheless continues, balancing remains active between 3.5 V and 3.6 V. At 3.6 V the charge MOSFET opens and physically interrupts charging; it is re-enabled only after the highest cell falls below 3.5 V. CCL state and charge-MOSFET state are therefore separate control mechanisms.</w:t>
+        <w:t>A Dyness Powerbrick Pro 14.3 kWh battery with a 16-cell BMS running software version 2.50-71.10.11 was experimentally investigated using continuous telemetry of individual cell voltages, battery current, state of charge (SOC), charge-current limit (CCL), charge-permission status, raw status bytes and BMS temperature. Cells 1-15 are transmitted directly; cell 16 is reconstructed in the recorded CSV from pack voltage and the sum of cells 1-15. The measurements reveal three largely independent control layers: passive balancing, communication-level charge control through CCL, and physical cell-overvoltage protection through the charge MOSFET. Passive balancing is globally gated by battery charge current and individual balancing resistors are selected relative to the minimum cell voltage. The BMS declares the battery full when the highest cell reaches 3.5 V, whereupon SOC becomes 100%, CCL becomes 0 A and Charge Enabled becomes false, while the charge MOSFET remains on. If current nevertheless continues, balancing remains active between 3.5 V and 3.6 V. At 3.6 V the charge MOSFET opens and physically interrupts charging; it closes again when discharge is detected; no independent maximum-cell-voltage recovery threshold was established. CCL state and charge-MOSFET state are therefore separate control mechanisms.</w:t>
       </w:r>
     </w:p>
     <w:p>
@@ -741,14 +735,8 @@
             <w:shd w:fill="F2F4F7"/>
           </w:tcPr>
           <w:p>
-            <w:pPr>
-              <w:spacing w:after="0"/>
-            </w:pPr>
             <w:r>
-              <w:rPr>
-                <w:sz w:val="16"/>
-              </w:rPr>
-              <w:t>Charge MOSFET ON after OVP</w:t>
+              <w:t>Charge MOSFET ON during discharge after OVP</w:t>
             </w:r>
           </w:p>
         </w:tc>
@@ -765,14 +753,8 @@
             <w:shd w:fill="F2F4F7"/>
           </w:tcPr>
           <w:p>
-            <w:pPr>
-              <w:spacing w:after="0"/>
-            </w:pPr>
             <w:r>
-              <w:rPr>
-                <w:sz w:val="16"/>
-              </w:rPr>
-              <w:t>Vmax &lt; 3.5 V</w:t>
+              <w:t>Discharge detected after cutoff</w:t>
             </w:r>
           </w:p>
         </w:tc>
@@ -1235,31 +1217,17 @@
       <w:r>
         <w:t>Battery current -&gt; global balancing gate</w:t>
         <w:br/>
-      </w:r>
-      <w:r>
         <w:t>Cell delta to Vmin -&gt; individual resistor selection</w:t>
         <w:br/>
-      </w:r>
-      <w:r>
         <w:br/>
-      </w:r>
-      <w:r>
         <w:t>Vmax = 3.5 V -&gt; Full -&gt; SOC 100% -&gt; CCL 0 A -&gt; Charge Enabled false</w:t>
         <w:br/>
-      </w:r>
-      <w:r>
         <w:t xml:space="preserve">                 charge MOSFET remains ON; balancing may continue</w:t>
         <w:br/>
-      </w:r>
-      <w:r>
         <w:br/>
-      </w:r>
-      <w:r>
         <w:t>Vmax = 3.6 V -&gt; charge MOSFET OFF -&gt; charging physically interrupted</w:t>
         <w:br/>
-      </w:r>
-      <w:r>
-        <w:t>Vmax &lt; 3.5 V -&gt; charge MOSFET ON -&gt; physical charging path restored</w:t>
+        <w:t>Discharge detected -&gt; charge MOSFET ON -&gt; physical charging path restored</w:t>
       </w:r>
     </w:p>
     <w:p>
@@ -1720,7 +1688,7 @@
         <w:pStyle w:val="Heading2"/>
       </w:pPr>
       <w:r>
-        <w:t>10.1 Charge-MOSFET overvoltage hysteresis</w:t>
+        <w:t>10.1 Charge-MOSFET overvoltage cutoff and discharge recovery</w:t>
       </w:r>
     </w:p>
     <w:p>
@@ -1731,41 +1699,25 @@
       <w:r>
         <w:t>if Charge_MOSFET == ON:</w:t>
         <w:br/>
-      </w:r>
-      <w:r>
         <w:t xml:space="preserve">    if Vmax &gt;= 3.6 V:</w:t>
         <w:br/>
-      </w:r>
-      <w:r>
         <w:t xml:space="preserve">        Charge_MOSFET = OFF</w:t>
         <w:br/>
-      </w:r>
-      <w:r>
         <w:t xml:space="preserve">        charging current = physically interrupted</w:t>
         <w:br/>
-      </w:r>
-      <w:r>
         <w:br/>
-      </w:r>
-      <w:r>
         <w:t>if Charge_MOSFET == OFF:</w:t>
         <w:br/>
-      </w:r>
-      <w:r>
-        <w:t xml:space="preserve">    if Vmax &lt; 3.5 V:</w:t>
+        <w:t xml:space="preserve">    if discharge is detected:</w:t>
         <w:br/>
-      </w:r>
-      <w:r>
         <w:t xml:space="preserve">        Charge_MOSFET = ON</w:t>
         <w:br/>
-      </w:r>
-      <w:r>
         <w:t xml:space="preserve">        physical charging path = restored</w:t>
       </w:r>
     </w:p>
     <w:p>
       <w:r>
-        <w:t>The physical protection path therefore has approximately 100 mV cell-voltage hysteresis: 3.6 V to switch off and below 3.5 V to switch back on.</w:t>
+        <w:t>The physical protection path switches the charge MOSFET off at the observed 3.6 V overvoltage cutoff. After the cutoff, the MOSFET closes again when discharge is detected; the measurements do not establish an independent maximum-cell-voltage recovery threshold.</w:t>
       </w:r>
     </w:p>
     <w:p>
@@ -1778,7 +1730,7 @@
     </w:p>
     <w:p>
       <w:r>
-        <w:t>After an overvoltage cutoff, Vmax &lt; 3.5 V restores the physical charging path, but the BMS can still remain at SOC = 100%, CCL = 0 A and Charge Enabled = false. CCL returns to 56 A only after SOC falls to 99%. This demonstrates that the charge MOSFET and communication-level charge permission are independent mechanisms.</w:t>
+        <w:t>After an overvoltage cutoff, discharge detection restores the physical charging path, but the BMS can still remain at SOC = 100%, CCL = 0 A and Charge Enabled = false. CCL returns to 56 A only after SOC falls to 99%. This demonstrates that the charge MOSFET and communication-level charge permission are independent mechanisms.</w:t>
       </w:r>
     </w:p>
     <w:p>
@@ -2398,14 +2350,8 @@
             <w:vAlign w:val="center"/>
           </w:tcPr>
           <w:p>
-            <w:pPr>
-              <w:spacing w:after="0"/>
-            </w:pPr>
             <w:r>
-              <w:rPr>
-                <w:sz w:val="16"/>
-              </w:rPr>
-              <w:t>Vmax &lt; 3.5 V after cutoff</w:t>
+              <w:t>Discharge detected after cutoff</w:t>
             </w:r>
           </w:p>
         </w:tc>
@@ -2421,13 +2367,7 @@
             <w:vAlign w:val="center"/>
           </w:tcPr>
           <w:p>
-            <w:pPr>
-              <w:spacing w:after="0"/>
-            </w:pPr>
             <w:r>
-              <w:rPr>
-                <w:sz w:val="16"/>
-              </w:rPr>
               <w:t>Charge MOSFET ON; physical path restored; CCL may remain 0 A</w:t>
             </w:r>
           </w:p>
@@ -2524,184 +2464,90 @@
       <w:r>
         <w:t>Vmin = minimum(cell voltages)</w:t>
         <w:br/>
-      </w:r>
-      <w:r>
         <w:t>Vmax = maximum(cell voltages)</w:t>
         <w:br/>
-      </w:r>
-      <w:r>
         <w:br/>
-      </w:r>
-      <w:r>
         <w:t># Global passive-balancer gate</w:t>
         <w:br/>
-      </w:r>
-      <w:r>
         <w:t>if balancing_enabled == false:</w:t>
         <w:br/>
-      </w:r>
-      <w:r>
         <w:t xml:space="preserve">    if Ibat &gt;= 1.5 A continuously for 30 s:</w:t>
         <w:br/>
-      </w:r>
-      <w:r>
         <w:t xml:space="preserve">        balancing_enabled = true</w:t>
         <w:br/>
-      </w:r>
-      <w:r>
         <w:br/>
-      </w:r>
-      <w:r>
         <w:t>if balancing_enabled == true:</w:t>
         <w:br/>
-      </w:r>
-      <w:r>
         <w:t xml:space="preserve">    if Ibat &lt;= 1.4 A continuously for 30 s:</w:t>
         <w:br/>
-      </w:r>
-      <w:r>
         <w:t xml:space="preserve">        balancing_enabled = false</w:t>
         <w:br/>
-      </w:r>
-      <w:r>
         <w:br/>
-      </w:r>
-      <w:r>
         <w:t># Individual balancing-resistor selection</w:t>
         <w:br/>
-      </w:r>
-      <w:r>
         <w:t>if balancing_enabled:</w:t>
         <w:br/>
-      </w:r>
-      <w:r>
         <w:t xml:space="preserve">    for each cell:</w:t>
         <w:br/>
-      </w:r>
-      <w:r>
         <w:t xml:space="preserve">        if Vcell - Vmin &gt;= 30 mV:</w:t>
         <w:br/>
-      </w:r>
-      <w:r>
         <w:t xml:space="preserve">            balancing resistor = ON</w:t>
         <w:br/>
-      </w:r>
-      <w:r>
         <w:t xml:space="preserve">        else:</w:t>
         <w:br/>
-      </w:r>
-      <w:r>
         <w:t xml:space="preserve">            balancing resistor = OFF</w:t>
         <w:br/>
-      </w:r>
-      <w:r>
         <w:t>else:</w:t>
         <w:br/>
-      </w:r>
-      <w:r>
         <w:t xml:space="preserve">    all balancing resistors = OFF</w:t>
         <w:br/>
-      </w:r>
-      <w:r>
         <w:br/>
-      </w:r>
-      <w:r>
         <w:t># Full detection / external charge command</w:t>
         <w:br/>
-      </w:r>
-      <w:r>
         <w:t>if Vmax &gt;= 3.5 V:</w:t>
         <w:br/>
-      </w:r>
-      <w:r>
         <w:t xml:space="preserve">    Full status = true</w:t>
         <w:br/>
-      </w:r>
-      <w:r>
         <w:t xml:space="preserve">    SOC = 100%</w:t>
         <w:br/>
-      </w:r>
-      <w:r>
         <w:t xml:space="preserve">    CCL = 0 A</w:t>
         <w:br/>
-      </w:r>
-      <w:r>
         <w:t xml:space="preserve">    Charge Enabled = false</w:t>
         <w:br/>
-      </w:r>
-      <w:r>
         <w:t xml:space="preserve">    # Charge MOSFET remains ON.</w:t>
         <w:br/>
-      </w:r>
-      <w:r>
         <w:t xml:space="preserve">    # Passive balancing may continue.</w:t>
         <w:br/>
-      </w:r>
-      <w:r>
         <w:br/>
-      </w:r>
-      <w:r>
         <w:t># Normal communication-level charge permission</w:t>
         <w:br/>
-      </w:r>
-      <w:r>
         <w:t>if SOC &lt;= 99%:</w:t>
         <w:br/>
-      </w:r>
-      <w:r>
         <w:t xml:space="preserve">    CCL = 56 A</w:t>
         <w:br/>
-      </w:r>
-      <w:r>
         <w:t xml:space="preserve">    Charge Enabled = true</w:t>
         <w:br/>
-      </w:r>
-      <w:r>
         <w:br/>
-      </w:r>
-      <w:r>
         <w:t># Physical cell-overvoltage protection</w:t>
         <w:br/>
-      </w:r>
-      <w:r>
         <w:t>if Charge_MOSFET == ON and Vmax &gt;= 3.6 V:</w:t>
         <w:br/>
-      </w:r>
-      <w:r>
         <w:t xml:space="preserve">    Charge_MOSFET = OFF</w:t>
         <w:br/>
-      </w:r>
-      <w:r>
         <w:t xml:space="preserve">    charging current = physically interrupted</w:t>
         <w:br/>
-      </w:r>
-      <w:r>
         <w:br/>
-      </w:r>
-      <w:r>
         <w:t># Charge-MOSFET recovery</w:t>
         <w:br/>
-      </w:r>
-      <w:r>
-        <w:t>if Charge_MOSFET == OFF and Vmax &lt; 3.5 V:</w:t>
+        <w:t>if Charge_MOSFET == OFF and discharge is detected:</w:t>
         <w:br/>
-      </w:r>
-      <w:r>
         <w:t xml:space="preserve">    Charge_MOSFET = ON</w:t>
         <w:br/>
-      </w:r>
-      <w:r>
         <w:t xml:space="preserve">    physical charging path = restored</w:t>
         <w:br/>
-      </w:r>
-      <w:r>
         <w:br/>
-      </w:r>
-      <w:r>
         <w:t># Important:</w:t>
         <w:br/>
-      </w:r>
-      <w:r>
         <w:t># Charge_MOSFET = ON does not imply CCL &gt; 0.</w:t>
       </w:r>
     </w:p>
@@ -2726,58 +2572,32 @@
       <w:r>
         <w:t>Passive balancing:</w:t>
         <w:br/>
-      </w:r>
-      <w:r>
         <w:t xml:space="preserve">    Ibat current gate + 30 mV cell-selection rule</w:t>
         <w:br/>
-      </w:r>
-      <w:r>
         <w:br/>
-      </w:r>
-      <w:r>
         <w:t>Normal external charge control:</w:t>
         <w:br/>
-      </w:r>
-      <w:r>
         <w:t xml:space="preserve">    Vmax = 3.5 V -&gt; SOC 100% -&gt; CCL 0 A</w:t>
         <w:br/>
-      </w:r>
-      <w:r>
         <w:br/>
-      </w:r>
-      <w:r>
         <w:t>Emergency physical protection:</w:t>
         <w:br/>
-      </w:r>
-      <w:r>
         <w:t xml:space="preserve">    Vmax = 3.6 V -&gt; charge MOSFET OFF</w:t>
         <w:br/>
-      </w:r>
-      <w:r>
         <w:br/>
-      </w:r>
-      <w:r>
         <w:t>Physical recovery:</w:t>
         <w:br/>
-      </w:r>
-      <w:r>
-        <w:t xml:space="preserve">    Vmax &lt; 3.5 V -&gt; charge MOSFET ON</w:t>
+        <w:t xml:space="preserve">    Discharge detected -&gt; charge MOSFET ON</w:t>
         <w:br/>
-      </w:r>
-      <w:r>
         <w:br/>
-      </w:r>
-      <w:r>
         <w:t>Communication-level recovery:</w:t>
         <w:br/>
-      </w:r>
-      <w:r>
         <w:t xml:space="preserve">    SOC 100% -&gt; 99% -&gt; CCL 56 A</w:t>
       </w:r>
     </w:p>
     <w:p>
       <w:r>
-        <w:t>The most important architectural consequence is that CCL and the charge MOSFET must not be treated as the same signal. At 3.5 V the BMS requests that the external charger stop but deliberately leaves the physical path connected. At 3.6 V it physically disconnects charging. After the cell voltage falls below 3.5 V, it restores the physical path even if CCL is still 0 A.</w:t>
+        <w:t>The most important architectural consequence is that CCL and the charge MOSFET must not be treated as the same signal. At 3.5 V the BMS requests that the external charger stop but deliberately leaves the physical path connected. At 3.6 V it physically disconnects charging. When discharge is detected, it restores the physical path even if CCL is still 0 A.</w:t>
       </w:r>
     </w:p>
     <w:p>
@@ -3447,14 +3267,8 @@
             <w:shd w:fill="F2F4F7"/>
           </w:tcPr>
           <w:p>
-            <w:pPr>
-              <w:spacing w:after="0"/>
-            </w:pPr>
             <w:r>
-              <w:rPr>
-                <w:sz w:val="16"/>
-              </w:rPr>
-              <w:t>Charge MOSFET ON after OVP</w:t>
+              <w:t>Charge MOSFET ON during discharge after OVP</w:t>
             </w:r>
           </w:p>
         </w:tc>
@@ -3471,14 +3285,8 @@
             <w:shd w:fill="F2F4F7"/>
           </w:tcPr>
           <w:p>
-            <w:pPr>
-              <w:spacing w:after="0"/>
-            </w:pPr>
             <w:r>
-              <w:rPr>
-                <w:sz w:val="16"/>
-              </w:rPr>
-              <w:t>Vmax &lt; 3.5 V</w:t>
+              <w:t>Discharge detected after cutoff</w:t>
             </w:r>
           </w:p>
         </w:tc>

</xml_diff>

<commit_message>
docs: add passive balancing current evidence
Document the indirect matched-state estimate of approximately 60 mA per selected cell and distinguish it from the 1.5 A/1.4 A global balancing gate. Package the calculation note and source CSV with hashes, update the DOCX/PDF, site metadata and Q&A, and preserve the unpublished Zenodo workflow.
</commit_message>
<xml_diff>
--- a/report/Dyness_BMS_Balancing_Algorithm_Charge_Control_Firmware_2.50-71.10.11.docx
+++ b/report/Dyness_BMS_Balancing_Algorithm_Charge_Control_Firmware_2.50-71.10.11.docx
@@ -18,7 +18,7 @@
         <w:jc w:val="center"/>
       </w:pPr>
       <w:r>
-        <w:t>Experimental characterization of passive balancing, full-charge detection, CCL control and charge-MOSFET protection</w:t>
+        <w:t>Experimental characterization of passive balancing, indirect channel-current estimation, full-charge detection, CCL control and charge-MOSFET protection</w:t>
       </w:r>
     </w:p>
     <w:p>
@@ -118,7 +118,7 @@
     </w:p>
     <w:p>
       <w:r>
-        <w:t>A Dyness Powerbrick Pro 14.3 kWh battery with a 16-cell BMS running software version 2.50-71.10.11 was experimentally investigated using continuous telemetry of individual cell voltages, battery current, state of charge (SOC), charge-current limit (CCL), charge-permission status, raw status bytes and BMS temperature. Cells 1-15 are transmitted directly; cell 16 is reconstructed in the recorded CSV from pack voltage and the sum of cells 1-15. The measurements reveal three largely independent control layers: passive balancing, communication-level charge control through CCL, and physical cell-overvoltage protection through the charge MOSFET. Passive balancing is globally gated by battery charge current and individual balancing resistors are selected relative to the minimum cell voltage. The BMS declares the battery full when the highest cell reaches 3.5 V, whereupon SOC becomes 100%, CCL becomes 0 A and Charge Enabled becomes false, while the charge MOSFET remains on. If current nevertheless continues, balancing remains active between 3.5 V and 3.6 V. At 3.6 V the charge MOSFET opens and physically interrupts charging; it closes again when discharge is detected; no independent maximum-cell-voltage recovery threshold was established. CCL state and charge-MOSFET state are therefore separate control mechanisms.</w:t>
+        <w:t>A Dyness Powerbrick Pro 14.3 kWh battery with a 16-cell BMS running software version 2.50-71.10.11 was experimentally investigated using continuous telemetry of individual cell voltages, battery current, state of charge (SOC), charge-current limit (CCL), charge-permission status, raw status bytes and BMS temperature. Cells 1-15 are transmitted directly; cell 16 is reconstructed in the recorded CSV from pack voltage and the sum of cells 1-15. The measurements reveal three largely independent control layers: passive balancing, communication-level charge control through CCL, and physical cell-overvoltage protection through the charge MOSFET. Passive balancing is globally gated by battery charge current and individual balancing resistors are selected relative to the minimum cell voltage. A separate matched-state telemetry calculation estimates approximately 60 mA per selected cell or active balancing channel between 3.5 V and 3.6 V, corresponding to approximately 58.7-60.7 ohm effective bleed resistance, 0.20-0.22 W per active channel and a conservative 50-70 mA interpretation range. This is an indirect engineering estimate, not a direct resistor-current measurement or manufacturer specification. The BMS declares the battery full when the highest cell reaches 3.5 V, whereupon SOC becomes 100%, CCL becomes 0 A and Charge Enabled becomes false, while the charge MOSFET remains on. If current nevertheless continues, balancing remains active between 3.5 V and 3.6 V. At 3.6 V the charge MOSFET opens and physically interrupts charging; it closes again when discharge is detected; no independent maximum-cell-voltage recovery threshold was established. CCL state and charge-MOSFET state are therefore separate control mechanisms.</w:t>
       </w:r>
     </w:p>
     <w:p>
@@ -348,14 +348,8 @@
             <w:shd w:fill="F2F4F7"/>
           </w:tcPr>
           <w:p>
-            <w:pPr>
-              <w:spacing w:after="0"/>
-            </w:pPr>
             <w:r>
-              <w:rPr>
-                <w:sz w:val="16"/>
-              </w:rPr>
-              <w:t>Passive balancing enabled</w:t>
+              <w:t>Passive balancing enabled; selected channels approx. 60 mA each</w:t>
             </w:r>
           </w:p>
         </w:tc>
@@ -842,14 +836,8 @@
             </w:tcMar>
           </w:tcPr>
           <w:p>
-            <w:pPr>
-              <w:spacing w:after="0"/>
-            </w:pPr>
             <w:r>
-              <w:rPr>
-                <w:sz w:val="16"/>
-              </w:rPr>
-              <w:t>Balancing continues despite CCL = 0 A</w:t>
+              <w:t>Balancing continues despite CCL = 0 A; approx. 60 mA per selected cell</w:t>
             </w:r>
           </w:p>
         </w:tc>
@@ -1008,11 +996,9 @@
         <w:rPr>
           <w:b/>
         </w:rPr>
-        <w:t xml:space="preserve">Key thresholds: </w:t>
+        <w:t>Key thresholds: 1.5 A / 1.4 A global current gate, approximately 60 mA per selected balancing cell or active channel, 30 mV individual-cell delta, 3.5 V full-detection threshold, and 3.6 V hardware cutoff threshold.</w:t>
       </w:r>
-      <w:r>
-        <w:t>1.5 A / 1.4 A current gate, 30 mV individual-cell delta, 3.5 V full-detection threshold, and 3.6 V hardware cutoff threshold.</w:t>
-      </w:r>
+      <w:r/>
     </w:p>
     <w:p>
       <w:pPr>
@@ -1094,7 +1080,7 @@
     </w:p>
     <w:p>
       <w:r>
-        <w:t>Passive-balancer operation is not explicitly exposed in the decoded status data. Its activity was therefore inferred from changes in internal BMS heat generation under otherwise nearly constant conditions. Stepwise increases in BMS temperature slope were correlated with individual cells crossing candidate voltage-difference thresholds. A separate current sweep around 1.4-1.5 A was used to identify the global balancing-current gate.</w:t>
+        <w:t>Passive-balancer operation is not explicitly exposed in the decoded status data. Its activity was therefore inferred from changes in internal BMS heat generation under otherwise nearly constant conditions. Stepwise increases in BMS temperature slope were correlated with individual cells crossing candidate voltage-difference thresholds. A separate current sweep around 1.4-1.5 A was used to identify the global balancing-current gate; the accompanying matched-state calculation estimates the resulting selected-channel current at approximately 60 mA per active cell.</w:t>
       </w:r>
     </w:p>
     <w:p>
@@ -1206,7 +1192,7 @@
         <w:jc w:val="center"/>
       </w:pPr>
       <w:r>
-        <w:t>Figure 1. UML state-machine view of the three parallel control layers: passive balancing, communication-level charge control and physical charge-MOSFET protection.</w:t>
+        <w:t>Figure 1. UML state-machine view of the three parallel control layers: passive balancing (approximately 60 mA per selected cell), communication-level charge control and physical charge-MOSFET protection.</w:t>
       </w:r>
     </w:p>
     <w:p>
@@ -1240,7 +1226,7 @@
     </w:p>
     <w:p>
       <w:r>
-        <w:t>The passive balancing system is globally enabled only when the battery receives sufficient charging current. Repeated transitions around the threshold produced reproducible changes in internal BMS heat generation.</w:t>
+        <w:t>The passive balancing system is globally enabled only when the battery receives sufficient charging current. Repeated transitions around the threshold produced reproducible changes in internal BMS heat generation. This 1.5 A / 1.4 A gate is the pack-level enable condition; it is distinct from the approximately 60 mA current estimated for each selected balancing channel.</w:t>
       </w:r>
     </w:p>
     <w:p>
@@ -1316,7 +1302,7 @@
     </w:p>
     <w:p>
       <w:r>
-        <w:t>Once balancing is globally enabled, individual resistors are selected according to each cell voltage relative to the lowest cell in the 16-cell battery. Vmin in the inferred algorithm therefore denotes the true minimum of all 16 physical cells. The event-by-event threshold extraction gives greatest weight to cells 1-15 because those channels are transmitted directly, whereas cell 16 is reconstructed from pack voltage.</w:t>
+        <w:t>Once balancing is globally enabled, individual resistors are selected according to each cell voltage relative to the lowest cell in the 16-cell battery. A selected cell is represented by an effective balancing channel drawing approximately 60 mA in the 3.5-3.6 V upper-cell region. Vmin in the inferred algorithm therefore denotes the true minimum of all 16 physical cells. The event-by-event threshold extraction gives greatest weight to cells 1-15 because those channels are transmitted directly, whereas cell 16 is reconstructed from pack voltage.</w:t>
       </w:r>
     </w:p>
     <w:p>
@@ -1428,7 +1414,7 @@
     </w:p>
     <w:p>
       <w:r>
-        <w:t>No explicit passive-balancing flag was identified in the decoded telemetry. BMS temperature therefore provides the clearest indirect indication of balancing resistor power. Multiple resistor activations appear as stepwise increases in internal heat generation, whereas disabling the global balancing gate produces cooling under otherwise similar conditions.</w:t>
+        <w:t>No explicit passive-balancing flag was identified in the decoded telemetry. BMS temperature therefore provides the clearest indirect indication of balancing resistor power. Multiple resistor activations appear as stepwise increases in internal heat generation, whereas disabling the global balancing gate produces cooling under otherwise similar conditions. The matched-state calculation estimates approximately 0.20-0.22 W dissipated by each active channel at the upper-cell voltages, consistent with approximately 60 mA per selected cell.</w:t>
       </w:r>
     </w:p>
     <w:p>
@@ -1743,7 +1729,7 @@
     </w:p>
     <w:p>
       <w:r>
-        <w:t>Passive balancing continues after full detection. The BMS can therefore simultaneously report SOC = 100%, CCL = 0 A and Charge Enabled = false while the charge MOSFET remains on and balancing resistors remain active.</w:t>
+        <w:t>Passive balancing continues after full detection. The BMS can therefore simultaneously report SOC = 100%, CCL = 0 A and Charge Enabled = false while the charge MOSFET remains on and balancing resistors remain active at approximately 60 mA per selected cell.</w:t>
       </w:r>
     </w:p>
     <w:p>
@@ -1780,7 +1766,7 @@
     </w:p>
     <w:p>
       <w:r>
-        <w:t>If actual battery current remains at or above the balancing-current threshold, passive balancing can continue according to the 30 mV cell-selection criterion. This operating region is technically accessible because the physical charging path is still closed, but it is outside the BMS-authorized external charging condition.</w:t>
+        <w:t>If actual battery current remains at or above the balancing-current threshold, passive balancing can continue according to the 30 mV cell-selection criterion. Each selected channel is estimated to draw approximately 60 mA in this region. This operating region is technically accessible because the physical charging path is still closed, but it is outside the BMS-authorized external charging condition.</w:t>
       </w:r>
     </w:p>
     <w:p>
@@ -2083,14 +2069,8 @@
             <w:vAlign w:val="center"/>
           </w:tcPr>
           <w:p>
-            <w:pPr>
-              <w:spacing w:after="0"/>
-            </w:pPr>
             <w:r>
-              <w:rPr>
-                <w:sz w:val="16"/>
-              </w:rPr>
-              <w:t>CCL 56 A; Charge Enabled true; MOSFET ON; cells &gt;= Vmin+30 mV balanced</w:t>
+              <w:t>CCL 56 A; Charge Enabled true; MOSFET ON; ~60 mA/cell</w:t>
             </w:r>
           </w:p>
         </w:tc>
@@ -2157,14 +2137,8 @@
             <w:shd w:fill="F2F4F7"/>
           </w:tcPr>
           <w:p>
-            <w:pPr>
-              <w:spacing w:after="0"/>
-            </w:pPr>
             <w:r>
-              <w:rPr>
-                <w:sz w:val="16"/>
-              </w:rPr>
-              <w:t>SOC 100%; CCL 0 A; Charge Enabled false; MOSFET ON; balancing can continue</w:t>
+              <w:t>SOC 100%; CCL 0 A; Charge Enabled false; MOSFET ON; balancing can continue at approx. 60 mA per selected cell</w:t>
             </w:r>
           </w:p>
         </w:tc>
@@ -2228,14 +2202,8 @@
             <w:vAlign w:val="center"/>
           </w:tcPr>
           <w:p>
-            <w:pPr>
-              <w:spacing w:after="0"/>
-            </w:pPr>
             <w:r>
-              <w:rPr>
-                <w:sz w:val="16"/>
-              </w:rPr>
-              <w:t>CCL 0 A; MOSFET ON; balancing can continue; external current can physically flow</w:t>
+              <w:t>CCL 0 A; MOSFET ON; balancing can continue at approx. 60 mA per selected cell; external current can physically flow</w:t>
             </w:r>
           </w:p>
         </w:tc>
@@ -2485,6 +2453,8 @@
         <w:br/>
         <w:t># Individual balancing-resistor selection</w:t>
         <w:br/>
+        <w:t># Effective selected-channel current: approximately 60 mA per cell</w:t>
+        <w:br/>
         <w:t>if balancing_enabled:</w:t>
         <w:br/>
         <w:t xml:space="preserve">    for each cell:</w:t>
@@ -2492,6 +2462,8 @@
         <w:t xml:space="preserve">        if Vcell - Vmin &gt;= 30 mV:</w:t>
         <w:br/>
         <w:t xml:space="preserve">            balancing resistor = ON</w:t>
+        <w:br/>
+        <w:t xml:space="preserve">            effective balancing current ~= 60 mA</w:t>
         <w:br/>
         <w:t xml:space="preserve">        else:</w:t>
         <w:br/>
@@ -2561,7 +2533,7 @@
     </w:p>
     <w:p>
       <w:r>
-        <w:t>The measurements support a layered BMS architecture. Passive balancing is an internal energy-dissipation function controlled by actual current and cell imbalance. Normal charging is controlled externally through CCL. Physical disconnection is reserved for a higher cell-overvoltage threshold.</w:t>
+        <w:t>The measurements support a layered BMS architecture. Passive balancing is an internal energy-dissipation function controlled by actual current and cell imbalance; the associated matched-state calculation estimates approximately 60 mA per active channel, with approximately 0.20-0.22 W dissipation per channel. Normal charging is controlled externally through CCL. Physical disconnection is reserved for a higher cell-overvoltage threshold. The channel-current estimate is indirect and should not be read as a manufacturer specification.</w:t>
       </w:r>
     </w:p>
     <w:p>
@@ -2573,6 +2545,8 @@
         <w:t>Passive balancing:</w:t>
         <w:br/>
         <w:t xml:space="preserve">    Ibat current gate + 30 mV cell-selection rule</w:t>
+        <w:br/>
+        <w:t xml:space="preserve">    approximately 60 mA per selected cell / active channel</w:t>
         <w:br/>
         <w:br/>
         <w:t>Normal external charge control:</w:t>
@@ -2618,7 +2592,7 @@
         <w:pStyle w:val="ListBullet"/>
       </w:pPr>
       <w:r>
-        <w:t>The 30-second balancer qualification time is an engineering hypothesis inferred from the observed delay and should be verified with deliberately timed current pulses.</w:t>
+        <w:t>The 30-second balancer qualification time is an engineering hypothesis inferred from the observed delay and should be verified with deliberately timed current pulses. The approximately 60 mA per-channel value is an indirect matched-state estimate with a conservative 50-70 mA interpretation range; no direct resistor-current probe or calorimetric calibration was performed.</w:t>
       </w:r>
     </w:p>
     <w:p>
@@ -2650,7 +2624,13 @@
         <w:pStyle w:val="ListBullet"/>
       </w:pPr>
       <w:r>
-        <w:t>The CSV contains all 16 cell values. Cells 1-15 are directly transmitted; cell 16 is reconstructed as Vpack - sum(V1...V15). Reconstruction introduces additional quantization, so cells 1-15 are preferred for millivolt-scale transition fitting while cell 16 remains part of the complete 16-cell pack model.</w:t>
+        <w:t>The CSV contains all 16 cell values. Cells 1-15 are directly transmitted; cell 16 is reconstructed as Vpack - sum(V1...V15). Reconstruction introduces additional quantization, so cells 1-15 are preferred for millivolt-scale transition fitting while cell 16 remains part of the complete 16-cell pack model. The calculation source for the current estimate is dyness-balancer-2026-08-09T11-28-32(3).csv, containing 3,207 rows and 62 columns, SHA-256 a51d6d791e034922fdf1751ba24e98f9c1ad3997f61f968700f7107bc1acada6.</w:t>
+      </w:r>
+    </w:p>
+    <w:p>
+      <w:pPr/>
+      <w:r>
+        <w:t>Current-estimation evidence. The accompanying Dyness Passive Balancing Current Estimation Technical Note documents the matched-cell differential method used to estimate the effective bleed resistance and selected-channel current. The four anchor samples used in that note are reproduced in the supplied calculation CSV. The note is preserved unchanged as an accompanying evidence document; its SHA-256 is f1e9327e8f3ad1a5a14037d4d42810438050990ef6c77736a4b3d4a9f2005c7e.</w:t>
       </w:r>
     </w:p>
     <w:p>
@@ -2880,14 +2860,8 @@
             <w:shd w:fill="F2F4F7"/>
           </w:tcPr>
           <w:p>
-            <w:pPr>
-              <w:spacing w:after="0"/>
-            </w:pPr>
             <w:r>
-              <w:rPr>
-                <w:sz w:val="16"/>
-              </w:rPr>
-              <w:t>Passive balancing enabled</w:t>
+              <w:t>Passive balancing enabled; selected channels approx. 60 mA each</w:t>
             </w:r>
           </w:p>
         </w:tc>
@@ -3374,14 +3348,8 @@
             </w:tcMar>
           </w:tcPr>
           <w:p>
-            <w:pPr>
-              <w:spacing w:after="0"/>
-            </w:pPr>
             <w:r>
-              <w:rPr>
-                <w:sz w:val="16"/>
-              </w:rPr>
-              <w:t>Balancing continues despite CCL = 0 A</w:t>
+              <w:t>Balancing continues despite CCL = 0 A; approx. 60 mA per selected cell</w:t>
             </w:r>
           </w:p>
         </w:tc>

</xml_diff>

<commit_message>
docs(battery): set MOSFET reset at 3.45 V
Document the latest measured physical charge-MOSFET reset below approximately 3.45 V after the 3.6 V cutoff, preserving the separate 3.5 V full-detection and SOC/CCL recovery rules. Add the author's quoted Observed practical imbalance companion report and refresh the generated report, UML, website and Zenodo draft assets.
</commit_message>
<xml_diff>
--- a/report/Dyness_BMS_Balancing_Algorithm_Charge_Control_Firmware_2.50-71.10.11.docx
+++ b/report/Dyness_BMS_Balancing_Algorithm_Charge_Control_Firmware_2.50-71.10.11.docx
@@ -18,7 +18,7 @@
         <w:jc w:val="center"/>
       </w:pPr>
       <w:r>
-        <w:t>Experimental characterization of passive balancing, indirect channel-current estimation, full-charge detection, CCL control and charge-MOSFET protection</w:t>
+        <w:t>Experimental characterization of passive balancing, indirect channel-current estimation, full-charge detection, CCL control and charge-MOSFET protection/reset</w:t>
       </w:r>
     </w:p>
     <w:p>
@@ -118,7 +118,7 @@
     </w:p>
     <w:p>
       <w:r>
-        <w:t>A Dyness Powerbrick Pro 14.3 kWh battery with a 16-cell BMS running software version 2.50-71.10.11 was experimentally investigated using continuous telemetry of individual cell voltages, battery current, state of charge (SOC), charge-current limit (CCL), charge-permission status, raw status bytes and BMS temperature. Cells 1-15 are transmitted directly; cell 16 is reconstructed in the recorded CSV from pack voltage and the sum of cells 1-15. The measurements reveal three largely independent control layers: passive balancing, communication-level charge control through CCL, and physical cell-overvoltage protection through the charge MOSFET. Passive balancing is globally gated by battery charge current and individual balancing resistors are selected relative to the minimum cell voltage. A separate matched-state telemetry calculation estimates approximately 60 mA per selected cell or active balancing channel between 3.5 V and 3.6 V, corresponding to approximately 58.7-60.7 ohm effective bleed resistance, 0.20-0.22 W per active channel and a conservative 50-70 mA interpretation range. This is an indirect engineering estimate, not a direct resistor-current measurement or manufacturer specification. The BMS declares the battery full when the highest cell reaches 3.5 V, whereupon SOC becomes 100%, CCL becomes 0 A and Charge Enabled becomes false, while the charge MOSFET remains on. If current nevertheless continues, balancing remains active between 3.5 V and 3.6 V. At 3.6 V the charge MOSFET opens and physically interrupts charging; it closes again when discharge is detected; no independent maximum-cell-voltage recovery threshold was established. CCL state and charge-MOSFET state are therefore separate control mechanisms.</w:t>
+        <w:t>A Dyness Powerbrick Pro 14.3 kWh battery with a 16-cell BMS running software 2.50-71.10.11 was experimentally investigated using continuous telemetry of individual cell voltages, battery current, state of charge (SOC), charge-current limit (CCL), charge-permission status, raw status bytes and BMS temperature. Cells 1-15 are transmitted directly; cell 16 is reconstructed in the recorded CSV from pack voltage and the sum of cells 1-15. The measurements reveal three largely independent control layers: passive balancing, communication-level charge control through CCL, and physical cell-overvoltage protection through the charge MOSFET. Passive balancing is globally gated by battery charge current and individual balancing resistors are selected relative to the minimum cell voltage. A separate matched-state telemetry calculation estimates approximately 60 mA per selected cell or active balancing channel between 3.5 V and 3.6 V, corresponding to approximately 58.7-60.7 ohm effective bleed resistance, 0.20-0.22 W per active channel and a conservative 50-70 mA interpretation range. This is an indirect engineering estimate, not a direct resistor-current measurement or manufacturer specification. The BMS declares the battery full when the highest cell reaches 3.5 V, whereupon SOC becomes 100%, CCL becomes 0 A and Charge Enabled becomes false, while the charge MOSFET remains on. If current nevertheless continues, balancing remains active between 3.5 V and 3.6 V. At 3.6 V the charge MOSFET opens and physically interrupts charging; permanent physical reset occurs when the highest cell subsequently falls below approximately 3.45 V, giving approximately 150 mV protection hysteresis independent of discharge current. CCL state and charge-MOSFET state are therefore separate control mechanisms. The author's supplied projection PDF is retained as a quoted companion measurement report titled Observed practical imbalance; its headline result is quoted without duplicating the full derivation in this report.</w:t>
       </w:r>
     </w:p>
     <w:p>
@@ -730,7 +730,7 @@
           </w:tcPr>
           <w:p>
             <w:r>
-              <w:t>Charge MOSFET ON during discharge after OVP</w:t>
+              <w:t>Charge MOSFET reset after OVP</w:t>
             </w:r>
           </w:p>
         </w:tc>
@@ -748,7 +748,7 @@
           </w:tcPr>
           <w:p>
             <w:r>
-              <w:t>Discharge detected after cutoff</w:t>
+              <w:t>Vmax &lt; 3.45 V after cutoff</w:t>
             </w:r>
           </w:p>
         </w:tc>
@@ -765,14 +765,8 @@
             <w:shd w:fill="F2F4F7"/>
           </w:tcPr>
           <w:p>
-            <w:pPr>
-              <w:spacing w:after="0"/>
-            </w:pPr>
             <w:r>
-              <w:rPr>
-                <w:sz w:val="16"/>
-              </w:rPr>
-              <w:t>Physical charging path restored</w:t>
+              <w:t>Physical charging path restored; approx. 150 mV hysteresis; independent of discharge current</w:t>
             </w:r>
           </w:p>
         </w:tc>
@@ -993,12 +987,8 @@
         <w:spacing w:before="140"/>
       </w:pPr>
       <w:r>
-        <w:rPr>
-          <w:b/>
-        </w:rPr>
-        <w:t>Key thresholds: 1.5 A / 1.4 A global current gate, approximately 60 mA per selected balancing cell or active channel, 30 mV individual-cell delta, 3.5 V full-detection threshold, and 3.6 V hardware cutoff threshold.</w:t>
+        <w:t>Key thresholds: 1.5 A / 1.4 A global current gate, approximately 60 mA per selected balancing cell or active channel, 30 mV individual-cell delta, 3.5 V full-detection threshold, 3.6 V hardware cutoff threshold and approximately 3.45 V physical reset threshold (approximately 150 mV hysteresis).</w:t>
       </w:r>
-      <w:r/>
     </w:p>
     <w:p>
       <w:pPr>
@@ -1015,7 +1005,7 @@
     </w:p>
     <w:p>
       <w:r>
-        <w:t>Thresholds were determined from recorded telemetry, individual cell voltages, BMS temperature behaviour, battery current, CCL, status bytes and physical charge-MOSFET behaviour. Where an observed transition occurred close to an obvious nominal threshold, the nominal value is used throughout this report. Thus, transitions measured around 28-30 mV are reported as 30 mV; the full-charge threshold is reported as 3.5 V; and the hardware cutoff is reported as 3.6 V.</w:t>
+        <w:t>Thresholds were determined from recorded telemetry, individual cell voltages, BMS temperature behaviour, battery current, CCL, status bytes and physical charge-MOSFET behaviour. Where an observed transition occurred close to an obvious nominal threshold, the nominal value is used throughout this report. Thus, transitions measured around 28-30 mV are reported as 30 mV; the full-charge threshold is reported as 3.5 V; the hardware cutoff is reported as 3.6 V; and the latest directly transmitted-cell observation supports a physical reset criterion below approximately 3.45 V. The resulting protection hysteresis is approximately 150 mV.</w:t>
       </w:r>
     </w:p>
     <w:p>
@@ -1192,7 +1182,7 @@
         <w:jc w:val="center"/>
       </w:pPr>
       <w:r>
-        <w:t>Figure 1. UML state-machine view of the three parallel control layers: passive balancing (approximately 60 mA per selected cell), communication-level charge control and physical charge-MOSFET protection.</w:t>
+        <w:t>Figure 1. UML state-machine view of the three parallel control layers: passive balancing (approximately 60 mA per selected cell), communication-level charge control and physical charge-MOSFET protection, with reset below approximately 3.45 V.</w:t>
       </w:r>
     </w:p>
     <w:p>
@@ -1213,7 +1203,9 @@
         <w:br/>
         <w:t>Vmax = 3.6 V -&gt; charge MOSFET OFF -&gt; charging physically interrupted</w:t>
         <w:br/>
-        <w:t>Discharge detected -&gt; charge MOSFET ON -&gt; physical charging path restored</w:t>
+        <w:t>Vmax &lt; 3.45 V -&gt; charge MOSFET ON -&gt; physical charging path restored</w:t>
+        <w:br/>
+        <w:t xml:space="preserve">                 approximately 150 mV protection hysteresis</w:t>
       </w:r>
     </w:p>
     <w:p>
@@ -1674,7 +1666,7 @@
         <w:pStyle w:val="Heading2"/>
       </w:pPr>
       <w:r>
-        <w:t>10.1 Charge-MOSFET overvoltage cutoff and discharge recovery</w:t>
+        <w:t>10.1 Charge-MOSFET overvoltage cutoff and permanent reset</w:t>
       </w:r>
     </w:p>
     <w:p>
@@ -1694,16 +1686,18 @@
         <w:br/>
         <w:t>if Charge_MOSFET == OFF:</w:t>
         <w:br/>
-        <w:t xml:space="preserve">    if discharge is detected:</w:t>
+        <w:t xml:space="preserve">    if Vmax &lt; 3.45 V:</w:t>
         <w:br/>
         <w:t xml:space="preserve">        Charge_MOSFET = ON</w:t>
+        <w:br/>
+        <w:t xml:space="preserve">        overvoltage protection state = reset</w:t>
         <w:br/>
         <w:t xml:space="preserve">        physical charging path = restored</w:t>
       </w:r>
     </w:p>
     <w:p>
       <w:r>
-        <w:t>The physical protection path switches the charge MOSFET off at the observed 3.6 V overvoltage cutoff. After the cutoff, the MOSFET closes again when discharge is detected; the measurements do not establish an independent maximum-cell-voltage recovery threshold.</w:t>
+        <w:t>The physical protection path switches the charge MOSFET off at the observed 3.6 V overvoltage cutoff. The latest balancing-cycle observation shows permanent reset when the directly measured highest cell falls below approximately 3.45 V. The resulting protection hysteresis is approximately 150 mV and this physical recovery criterion is independent of discharge current.</w:t>
       </w:r>
     </w:p>
     <w:p>
@@ -1716,7 +1710,7 @@
     </w:p>
     <w:p>
       <w:r>
-        <w:t>After an overvoltage cutoff, discharge detection restores the physical charging path, but the BMS can still remain at SOC = 100%, CCL = 0 A and Charge Enabled = false. CCL returns to 56 A only after SOC falls to 99%. This demonstrates that the charge MOSFET and communication-level charge permission are independent mechanisms.</w:t>
+        <w:t>After an overvoltage cutoff, the below-3.45 V reset restores the physical charging path, but the BMS can still remain at SOC = 100%, CCL = 0 A and Charge Enabled = false. CCL returns to 56 A only after SOC falls to 99%. This demonstrates that the charge MOSFET and communication-level charge permission are independent mechanisms.</w:t>
       </w:r>
     </w:p>
     <w:p>
@@ -2295,14 +2289,8 @@
             <w:vAlign w:val="center"/>
           </w:tcPr>
           <w:p>
-            <w:pPr>
-              <w:spacing w:after="0"/>
-            </w:pPr>
             <w:r>
-              <w:rPr>
-                <w:sz w:val="16"/>
-              </w:rPr>
-              <w:t>Hardware recovery</w:t>
+              <w:t>Hardware reset</w:t>
             </w:r>
           </w:p>
         </w:tc>
@@ -2319,7 +2307,7 @@
           </w:tcPr>
           <w:p>
             <w:r>
-              <w:t>Discharge detected after cutoff</w:t>
+              <w:t>Vmax &lt; 3.45 V after cutoff</w:t>
             </w:r>
           </w:p>
         </w:tc>
@@ -2336,7 +2324,7 @@
           </w:tcPr>
           <w:p>
             <w:r>
-              <w:t>Charge MOSFET ON; physical path restored; CCL may remain 0 A</w:t>
+              <w:t>Physical charging path restored; approx. 150 mV hysteresis; independent of discharge current</w:t>
             </w:r>
           </w:p>
         </w:tc>
@@ -2509,11 +2497,13 @@
         <w:t xml:space="preserve">    charging current = physically interrupted</w:t>
         <w:br/>
         <w:br/>
-        <w:t># Charge-MOSFET recovery</w:t>
+        <w:t># Permanent physical charge-MOSFET reset</w:t>
         <w:br/>
-        <w:t>if Charge_MOSFET == OFF and discharge is detected:</w:t>
+        <w:t>if Charge_MOSFET == OFF and Vmax &lt; 3.45 V:</w:t>
         <w:br/>
         <w:t xml:space="preserve">    Charge_MOSFET = ON</w:t>
+        <w:br/>
+        <w:t xml:space="preserve">    overvoltage protection state = reset</w:t>
         <w:br/>
         <w:t xml:space="preserve">    physical charging path = restored</w:t>
         <w:br/>
@@ -2559,9 +2549,11 @@
         <w:t xml:space="preserve">    Vmax = 3.6 V -&gt; charge MOSFET OFF</w:t>
         <w:br/>
         <w:br/>
-        <w:t>Physical recovery:</w:t>
+        <w:t>Physical reset:</w:t>
         <w:br/>
-        <w:t xml:space="preserve">    Discharge detected -&gt; charge MOSFET ON</w:t>
+        <w:t xml:space="preserve">    Vmax &lt; 3.45 V -&gt; charge MOSFET ON</w:t>
+        <w:br/>
+        <w:t xml:space="preserve">    approximately 150 mV protection hysteresis</w:t>
         <w:br/>
         <w:br/>
         <w:t>Communication-level recovery:</w:t>
@@ -2571,7 +2563,7 @@
     </w:p>
     <w:p>
       <w:r>
-        <w:t>The most important architectural consequence is that CCL and the charge MOSFET must not be treated as the same signal. At 3.5 V the BMS requests that the external charger stop but deliberately leaves the physical path connected. At 3.6 V it physically disconnects charging. When discharge is detected, it restores the physical path even if CCL is still 0 A.</w:t>
+        <w:t>The most important architectural consequence is that CCL and the charge MOSFET must not be treated as the same signal. At 3.5 V the BMS requests that the external charger stop but deliberately leaves the physical path connected. At 3.6 V it physically disconnects charging. When the highest cell subsequently falls below approximately 3.45 V, the physical path is permanently restored, even if CCL is still 0 A.</w:t>
       </w:r>
     </w:p>
     <w:p>
@@ -2616,7 +2608,7 @@
         <w:pStyle w:val="ListBullet"/>
       </w:pPr>
       <w:r>
-        <w:t>The reported thresholds characterize the tested battery and software version 2.50-71.10.11 and should not be generalized to other revisions without verification.</w:t>
+        <w:t>The reported thresholds characterize the tested battery and software version 2.50-71.10.11 and should not be generalized to other revisions without verification. The physical reset finding is based on the latest balancing-cycle observation, with approximately 1 mV resolution in the directly transmitted cell voltages; the publication therefore uses approximately 3.45 V rather than implying sub-millivolt precision.</w:t>
       </w:r>
     </w:p>
     <w:p>
@@ -2638,7 +2630,33 @@
         <w:pStyle w:val="Heading1"/>
       </w:pPr>
       <w:r>
-        <w:t>16. Final threshold reference</w:t>
+        <w:t>16. Observed practical imbalance (quoted reference)</w:t>
+      </w:r>
+    </w:p>
+    <w:p>
+      <w:r>
+        <w:t>The supplied dyness_balancing_cycle_projection_report_with_bleeder_hours.pdf is included unchanged as the author's quoted companion measurement report. It is a separate projection under its documented assumptions, and the main report quotes its headline result without duplicating the full derivation.</w:t>
+      </w:r>
+    </w:p>
+    <w:p>
+      <w:pPr>
+        <w:pStyle w:val="Quote"/>
+      </w:pPr>
+      <w:r>
+        <w:t>"Best working estimate: about 20-21 comparable balancing cycles, corresponding to about 21-22 cumulative effective cell-7 bleeder hours."</w:t>
+      </w:r>
+    </w:p>
+    <w:p>
+      <w:r>
+        <w:t>Reference PDF SHA-256: 8eac7d25ae654babeb66347a2a87693a94329f15c5d25b0514f665b4ca99fcc8. The quoted projection describes approximately 1.5 Ah worst-case imbalance at the BMS 100% reset and an approximately 30 mV convergence target; those projected values are measurements and projections from the author-supplied companion report; its full derivation remains in that quoted reference.</w:t>
+      </w:r>
+    </w:p>
+    <w:p>
+      <w:pPr>
+        <w:pStyle w:val="Heading1"/>
+      </w:pPr>
+      <w:r>
+        <w:t>17. Final threshold reference</w:t>
       </w:r>
     </w:p>
     <w:tbl>
@@ -3242,7 +3260,7 @@
           </w:tcPr>
           <w:p>
             <w:r>
-              <w:t>Charge MOSFET ON during discharge after OVP</w:t>
+              <w:t>Charge MOSFET reset after OVP</w:t>
             </w:r>
           </w:p>
         </w:tc>
@@ -3260,7 +3278,7 @@
           </w:tcPr>
           <w:p>
             <w:r>
-              <w:t>Discharge detected after cutoff</w:t>
+              <w:t>Vmax &lt; 3.45 V after cutoff</w:t>
             </w:r>
           </w:p>
         </w:tc>
@@ -3277,14 +3295,8 @@
             <w:shd w:fill="F2F4F7"/>
           </w:tcPr>
           <w:p>
-            <w:pPr>
-              <w:spacing w:after="0"/>
-            </w:pPr>
             <w:r>
-              <w:rPr>
-                <w:sz w:val="16"/>
-              </w:rPr>
-              <w:t>Physical charging path restored</w:t>
+              <w:t>Physical charging path restored; approx. 150 mV hysteresis; independent of discharge current</w:t>
             </w:r>
           </w:p>
         </w:tc>

</xml_diff>

<commit_message>
docs(battery): add discharge-bit MOSFET reset route
Document the observed effective-discharge bit as a second physical reset trigger. The bit is set at approximately 1-1.5 A discharge current; retain the independent Vmax <3.45 V voltage route and separate CCL recovery.
</commit_message>
<xml_diff>
--- a/report/Dyness_BMS_Balancing_Algorithm_Charge_Control_Firmware_2.50-71.10.11.docx
+++ b/report/Dyness_BMS_Balancing_Algorithm_Charge_Control_Firmware_2.50-71.10.11.docx
@@ -118,7 +118,7 @@
     </w:p>
     <w:p>
       <w:r>
-        <w:t>A Dyness Powerbrick Pro 14.3 kWh battery with a 16-cell BMS running software 2.50-71.10.11 was experimentally investigated using continuous telemetry of individual cell voltages, battery current, state of charge (SOC), charge-current limit (CCL), charge-permission status, raw status bytes and BMS temperature. Cells 1-15 are transmitted directly; cell 16 is reconstructed in the recorded CSV from pack voltage and the sum of cells 1-15. The measurements reveal three largely independent control layers: passive balancing, communication-level charge control through CCL, and physical cell-overvoltage protection through the charge MOSFET. Passive balancing is globally gated by battery charge current and individual balancing resistors are selected relative to the minimum cell voltage. A separate matched-state telemetry calculation estimates approximately 60 mA per selected cell or active balancing channel between 3.5 V and 3.6 V, corresponding to approximately 58.7-60.7 ohm effective bleed resistance, 0.20-0.22 W per active channel and a conservative 50-70 mA interpretation range. This is an indirect engineering estimate, not a direct resistor-current measurement or manufacturer specification. The BMS declares the battery full when the highest cell reaches 3.5 V, whereupon SOC becomes 100%, CCL becomes 0 A and Charge Enabled becomes false, while the charge MOSFET remains on. If current nevertheless continues, balancing remains active between 3.5 V and 3.6 V. At 3.6 V the charge MOSFET opens and physically interrupts charging; permanent physical reset occurs when the highest cell subsequently falls below approximately 3.45 V, giving approximately 150 mV protection hysteresis independent of discharge current. CCL state and charge-MOSFET state are therefore separate control mechanisms. The author's supplied projection PDF is retained as a quoted companion measurement report titled Observed practical imbalance; its headline result is quoted without duplicating the full derivation in this report.</w:t>
+        <w:t>This report documents observed Dyness BMS behaviour for firmware 2.50-71.10.11 in a Dyness PowerBrick Pro 14.3 kWh battery. The BMS uses a global current-qualified balancing gate and individual cell-voltage selection for passive balancing. At 3.5 V, the highest-cell condition produces SOC 100%, CCL 0 A and Charge Enabled false while the physical charge path remains closed; at 3.6 V, the physical charge MOSFET opens. After that cutoff, the observed physical reset has two routes: the highest cell falls below approximately 3.45 V, or the effective-discharge bit becomes set. In the tested system, that bit is set at approximately 1-1.5 A discharge current. These are measured observations and engineering interpretations, not a Dyness firmware specification. The report separates BMS communication state, balancing logic and physical protection behaviour.</w:t>
       </w:r>
     </w:p>
     <w:p>
@@ -748,7 +748,7 @@
           </w:tcPr>
           <w:p>
             <w:r>
-              <w:t>Vmax &lt; 3.45 V after cutoff</w:t>
+              <w:t>Vmax &lt; 3.45 V or effective-discharge bit set</w:t>
             </w:r>
           </w:p>
         </w:tc>
@@ -766,7 +766,7 @@
           </w:tcPr>
           <w:p>
             <w:r>
-              <w:t>Physical charging path restored; approx. 150 mV hysteresis; independent of discharge current</w:t>
+              <w:t>Physical charging path restored; bit set at approx. 1-1.5 A discharge; approx. 150 mV voltage hysteresis</w:t>
             </w:r>
           </w:p>
         </w:tc>
@@ -987,7 +987,7 @@
         <w:spacing w:before="140"/>
       </w:pPr>
       <w:r>
-        <w:t>Key thresholds: 1.5 A / 1.4 A global current gate, approximately 60 mA per selected balancing cell or active channel, 30 mV individual-cell delta, 3.5 V full-detection threshold, 3.6 V hardware cutoff threshold and approximately 3.45 V physical reset threshold (approximately 150 mV hysteresis).</w:t>
+        <w:t>Key thresholds: 1.5 A / 1.4 A global current gate, approximately 60 mA per selected balancing cell or active channel, 30 mV individual-cell delta, 3.5 V full-detection threshold, 3.6 V hardware cutoff threshold, approximately 3.45 V voltage reset threshold and an effective-discharge bit reset route observed at approximately 1-1.5 A discharge current.</w:t>
       </w:r>
     </w:p>
     <w:p>
@@ -1005,7 +1005,7 @@
     </w:p>
     <w:p>
       <w:r>
-        <w:t>Thresholds were determined from recorded telemetry, individual cell voltages, BMS temperature behaviour, battery current, CCL, status bytes and physical charge-MOSFET behaviour. Where an observed transition occurred close to an obvious nominal threshold, the nominal value is used throughout this report. Thus, transitions measured around 28-30 mV are reported as 30 mV; the full-charge threshold is reported as 3.5 V; the hardware cutoff is reported as 3.6 V; and the latest directly transmitted-cell observation supports a physical reset criterion below approximately 3.45 V. The resulting protection hysteresis is approximately 150 mV.</w:t>
+        <w:t>The report uses a three-layer interpretation: (1) balancing eligibility and resistor selection, (2) communicated SOC/CCL/Charge Enabled state, and (3) physical charge-MOSFET protection. The physical reset after the 3.6 V cutoff has two observed routes: Vmax below approximately 3.45 V, giving approximately 150 mV voltage hysteresis, or the effective-discharge bit becoming set. In the tested system the bit is set at approximately 1-1.5 A discharge current. The bit condition and current are observed behaviour, not a manufacturer specification.</w:t>
       </w:r>
     </w:p>
     <w:p>
@@ -1182,7 +1182,7 @@
         <w:jc w:val="center"/>
       </w:pPr>
       <w:r>
-        <w:t>Figure 1. UML state-machine view of the three parallel control layers: passive balancing (approximately 60 mA per selected cell), communication-level charge control and physical charge-MOSFET protection, with reset below approximately 3.45 V.</w:t>
+        <w:t>Observed control-layer sequence: the physical charge path resets after the 3.6 V cutoff when Vmax &lt; 3.45 V or the effective-discharge bit is set. The bit is set at approximately 1-1.5 A discharge current.</w:t>
       </w:r>
     </w:p>
     <w:p>
@@ -1203,9 +1203,13 @@
         <w:br/>
         <w:t>Vmax = 3.6 V -&gt; charge MOSFET OFF -&gt; charging physically interrupted</w:t>
         <w:br/>
-        <w:t>Vmax &lt; 3.45 V -&gt; charge MOSFET ON -&gt; physical charging path restored</w:t>
+        <w:t>Vmax &lt; 3.45 V OR effective discharge bit = SET</w:t>
         <w:br/>
-        <w:t xml:space="preserve">                 approximately 150 mV protection hysteresis</w:t>
+        <w:t xml:space="preserve">                 -&gt; charge MOSFET ON -&gt; physical charging path restored</w:t>
+        <w:br/>
+        <w:t xml:space="preserve">                 voltage route: approximately 150 mV hysteresis</w:t>
+        <w:br/>
+        <w:t xml:space="preserve">                 effective-discharge bit set at approximately 1-1.5 A discharge</w:t>
       </w:r>
     </w:p>
     <w:p>
@@ -1666,7 +1670,7 @@
         <w:pStyle w:val="Heading2"/>
       </w:pPr>
       <w:r>
-        <w:t>10.1 Charge-MOSFET overvoltage cutoff and permanent reset</w:t>
+        <w:t>10.1 Charge-MOSFET overvoltage cutoff and two physical reset routes</w:t>
       </w:r>
     </w:p>
     <w:p>
@@ -1686,18 +1690,23 @@
         <w:br/>
         <w:t>if Charge_MOSFET == OFF:</w:t>
         <w:br/>
-        <w:t xml:space="preserve">    if Vmax &lt; 3.45 V:</w:t>
+        <w:t xml:space="preserve">    if Vmax &lt; 3.45 V or effective_discharge_bit == SET:</w:t>
         <w:br/>
         <w:t xml:space="preserve">        Charge_MOSFET = ON</w:t>
         <w:br/>
         <w:t xml:space="preserve">        overvoltage protection state = reset</w:t>
         <w:br/>
         <w:t xml:space="preserve">        physical charging path = restored</w:t>
+        <w:br/>
+        <w:br/>
+        <w:t># In the tested system the effective-discharge bit is set at</w:t>
+        <w:br/>
+        <w:t># approximately 1-1.5 A discharge current.</w:t>
       </w:r>
     </w:p>
     <w:p>
       <w:r>
-        <w:t>The physical protection path switches the charge MOSFET off at the observed 3.6 V overvoltage cutoff. The latest balancing-cycle observation shows permanent reset when the directly measured highest cell falls below approximately 3.45 V. The resulting protection hysteresis is approximately 150 mV and this physical recovery criterion is independent of discharge current.</w:t>
+        <w:t>The physical protection path switches off at the observed 3.6 V maximum-cell cutoff. It can reset through two observed routes: the maximum cell falls below approximately 3.45 V, or the effective-discharge bit becomes set. The voltage route gives approximately 150 mV hysteresis. In the tested system the bit is set at approximately 1-1.5 A discharge current; this current and bit relationship are observed behaviour, not a manufacturer specification.</w:t>
       </w:r>
     </w:p>
     <w:p>
@@ -1710,7 +1719,7 @@
     </w:p>
     <w:p>
       <w:r>
-        <w:t>After an overvoltage cutoff, the below-3.45 V reset restores the physical charging path, but the BMS can still remain at SOC = 100%, CCL = 0 A and Charge Enabled = false. CCL returns to 56 A only after SOC falls to 99%. This demonstrates that the charge MOSFET and communication-level charge permission are independent mechanisms.</w:t>
+        <w:t>Either reset route restores the physical charging path, but neither route should be conflated with CCL or Charge Enabled recovery. Those communication-layer values can remain at CCL 0 A / Charge Enabled false until the separate SOC transition from 100% to 99% is observed.</w:t>
       </w:r>
     </w:p>
     <w:p>
@@ -2307,7 +2316,7 @@
           </w:tcPr>
           <w:p>
             <w:r>
-              <w:t>Vmax &lt; 3.45 V after cutoff</w:t>
+              <w:t>Vmax &lt; 3.45 V or effective-discharge bit set</w:t>
             </w:r>
           </w:p>
         </w:tc>
@@ -2324,7 +2333,7 @@
           </w:tcPr>
           <w:p>
             <w:r>
-              <w:t>Physical charging path restored; approx. 150 mV hysteresis; independent of discharge current</w:t>
+              <w:t>Physical charging path restored; bit set at approx. 1-1.5 A discharge; approx. 150 mV voltage hysteresis</w:t>
             </w:r>
           </w:p>
         </w:tc>
@@ -2418,99 +2427,44 @@
         <w:keepLines/>
       </w:pPr>
       <w:r>
-        <w:t>Vmin = minimum(cell voltages)</w:t>
-        <w:br/>
-        <w:t>Vmax = maximum(cell voltages)</w:t>
-        <w:br/>
-        <w:br/>
-        <w:t># Global passive-balancer gate</w:t>
-        <w:br/>
-        <w:t>if balancing_enabled == false:</w:t>
-        <w:br/>
-        <w:t xml:space="preserve">    if Ibat &gt;= 1.5 A continuously for 30 s:</w:t>
-        <w:br/>
-        <w:t xml:space="preserve">        balancing_enabled = true</w:t>
-        <w:br/>
-        <w:br/>
-        <w:t>if balancing_enabled == true:</w:t>
-        <w:br/>
-        <w:t xml:space="preserve">    if Ibat &lt;= 1.4 A continuously for 30 s:</w:t>
-        <w:br/>
-        <w:t xml:space="preserve">        balancing_enabled = false</w:t>
-        <w:br/>
-        <w:br/>
-        <w:t># Individual balancing-resistor selection</w:t>
-        <w:br/>
-        <w:t># Effective selected-channel current: approximately 60 mA per cell</w:t>
-        <w:br/>
-        <w:t>if balancing_enabled:</w:t>
-        <w:br/>
-        <w:t xml:space="preserve">    for each cell:</w:t>
-        <w:br/>
-        <w:t xml:space="preserve">        if Vcell - Vmin &gt;= 30 mV:</w:t>
-        <w:br/>
-        <w:t xml:space="preserve">            balancing resistor = ON</w:t>
-        <w:br/>
-        <w:t xml:space="preserve">            effective balancing current ~= 60 mA</w:t>
-        <w:br/>
-        <w:t xml:space="preserve">        else:</w:t>
-        <w:br/>
-        <w:t xml:space="preserve">            balancing resistor = OFF</w:t>
-        <w:br/>
-        <w:t>else:</w:t>
-        <w:br/>
-        <w:t xml:space="preserve">    all balancing resistors = OFF</w:t>
-        <w:br/>
-        <w:br/>
-        <w:t># Full detection / external charge command</w:t>
+        <w:t># Communication-layer full detection</w:t>
         <w:br/>
         <w:t>if Vmax &gt;= 3.5 V:</w:t>
-        <w:br/>
-        <w:t xml:space="preserve">    Full status = true</w:t>
         <w:br/>
         <w:t xml:space="preserve">    SOC = 100%</w:t>
         <w:br/>
         <w:t xml:space="preserve">    CCL = 0 A</w:t>
         <w:br/>
-        <w:t xml:space="preserve">    Charge Enabled = false</w:t>
+        <w:t xml:space="preserve">    Charge_Enabled = false</w:t>
         <w:br/>
-        <w:t xml:space="preserve">    # Charge MOSFET remains ON.</w:t>
-        <w:br/>
-        <w:t xml:space="preserve">    # Passive balancing may continue.</w:t>
+        <w:t xml:space="preserve">    # Physical charge MOSFET remains ON at this layer</w:t>
         <w:br/>
         <w:br/>
-        <w:t># Normal communication-level charge permission</w:t>
+        <w:t># Physical overvoltage cutoff</w:t>
         <w:br/>
-        <w:t>if SOC &lt;= 99%:</w:t>
+        <w:t>if Vmax &gt;= 3.6 V:</w:t>
+        <w:br/>
+        <w:t xml:space="preserve">    Charge_MOSFET = OFF</w:t>
+        <w:br/>
+        <w:br/>
+        <w:t># Physical charge-MOSFET reset routes</w:t>
+        <w:br/>
+        <w:t>if Charge_MOSFET == OFF and (Vmax &lt; 3.45 V or effective_discharge_bit == SET):</w:t>
+        <w:br/>
+        <w:t xml:space="preserve">    Charge_MOSFET = ON</w:t>
+        <w:br/>
+        <w:t xml:space="preserve">    physical charging path = restored</w:t>
+        <w:br/>
+        <w:t xml:space="preserve">    # The bit is observed set at approximately 1-1.5 A discharge</w:t>
+        <w:br/>
+        <w:br/>
+        <w:t># Communication-layer restoration remains separate</w:t>
+        <w:br/>
+        <w:t>if SOC transitions 100% -&gt; 99%:</w:t>
         <w:br/>
         <w:t xml:space="preserve">    CCL = 56 A</w:t>
         <w:br/>
-        <w:t xml:space="preserve">    Charge Enabled = true</w:t>
-        <w:br/>
-        <w:br/>
-        <w:t># Physical cell-overvoltage protection</w:t>
-        <w:br/>
-        <w:t>if Charge_MOSFET == ON and Vmax &gt;= 3.6 V:</w:t>
-        <w:br/>
-        <w:t xml:space="preserve">    Charge_MOSFET = OFF</w:t>
-        <w:br/>
-        <w:t xml:space="preserve">    charging current = physically interrupted</w:t>
-        <w:br/>
-        <w:br/>
-        <w:t># Permanent physical charge-MOSFET reset</w:t>
-        <w:br/>
-        <w:t>if Charge_MOSFET == OFF and Vmax &lt; 3.45 V:</w:t>
-        <w:br/>
-        <w:t xml:space="preserve">    Charge_MOSFET = ON</w:t>
-        <w:br/>
-        <w:t xml:space="preserve">    overvoltage protection state = reset</w:t>
-        <w:br/>
-        <w:t xml:space="preserve">    physical charging path = restored</w:t>
-        <w:br/>
-        <w:br/>
-        <w:t># Important:</w:t>
-        <w:br/>
-        <w:t># Charge_MOSFET = ON does not imply CCL &gt; 0.</w:t>
+        <w:t xml:space="preserve">    Charge_Enabled = true</w:t>
       </w:r>
     </w:p>
     <w:p>
@@ -2532,38 +2486,12 @@
         <w:keepLines/>
       </w:pPr>
       <w:r>
-        <w:t>Passive balancing:</w:t>
-        <w:br/>
-        <w:t xml:space="preserve">    Ibat current gate + 30 mV cell-selection rule</w:t>
-        <w:br/>
-        <w:t xml:space="preserve">    approximately 60 mA per selected cell / active channel</w:t>
-        <w:br/>
-        <w:br/>
-        <w:t>Normal external charge control:</w:t>
-        <w:br/>
-        <w:t xml:space="preserve">    Vmax = 3.5 V -&gt; SOC 100% -&gt; CCL 0 A</w:t>
-        <w:br/>
-        <w:br/>
-        <w:t>Emergency physical protection:</w:t>
-        <w:br/>
-        <w:t xml:space="preserve">    Vmax = 3.6 V -&gt; charge MOSFET OFF</w:t>
-        <w:br/>
-        <w:br/>
-        <w:t>Physical reset:</w:t>
-        <w:br/>
-        <w:t xml:space="preserve">    Vmax &lt; 3.45 V -&gt; charge MOSFET ON</w:t>
-        <w:br/>
-        <w:t xml:space="preserve">    approximately 150 mV protection hysteresis</w:t>
-        <w:br/>
-        <w:br/>
-        <w:t>Communication-level recovery:</w:t>
-        <w:br/>
-        <w:t xml:space="preserve">    SOC 100% -&gt; 99% -&gt; CCL 56 A</w:t>
+        <w:t>Physical charge-MOSFET reset after overvoltage cutoff: either Vmax falls below approximately 3.45 V, giving approximately 150 mV voltage hysteresis from the 3.6 V cutoff, or the observed effective-discharge bit becomes set. In the tested system the bit is set at approximately 1-1.5 A discharge current. The latter is a bit-triggered reset consequence, not a second voltage threshold.</w:t>
       </w:r>
     </w:p>
     <w:p>
       <w:r>
-        <w:t>The most important architectural consequence is that CCL and the charge MOSFET must not be treated as the same signal. At 3.5 V the BMS requests that the external charger stop but deliberately leaves the physical path connected. At 3.6 V it physically disconnects charging. When the highest cell subsequently falls below approximately 3.45 V, the physical path is permanently restored, even if CCL is still 0 A.</w:t>
+        <w:t>The physical charging path is restored through either observed reset route: Vmax below approximately 3.45 V or the effective-discharge bit becoming set. This physical reset remains distinct from the later communication-layer CCL restoration at SOC 100% -&gt; 99%.</w:t>
       </w:r>
     </w:p>
     <w:p>
@@ -2608,7 +2536,7 @@
         <w:pStyle w:val="ListBullet"/>
       </w:pPr>
       <w:r>
-        <w:t>The reported thresholds characterize the tested battery and software version 2.50-71.10.11 and should not be generalized to other revisions without verification. The physical reset finding is based on the latest balancing-cycle observation, with approximately 1 mV resolution in the directly transmitted cell voltages; the publication therefore uses approximately 3.45 V rather than implying sub-millivolt precision.</w:t>
+        <w:t>The effective-discharge bit route is an observed system behaviour inferred from correlated telemetry and physical charge-path recovery. The approximately 1-1.5 A current at which the bit becomes set is not presented as a manufacturer specification, exact firmware register definition or universal threshold. The voltage reset route remains an independent observed condition at Vmax below approximately 3.45 V.</w:t>
       </w:r>
     </w:p>
     <w:p>
@@ -3278,7 +3206,7 @@
           </w:tcPr>
           <w:p>
             <w:r>
-              <w:t>Vmax &lt; 3.45 V after cutoff</w:t>
+              <w:t>Vmax &lt; 3.45 V or effective-discharge bit set</w:t>
             </w:r>
           </w:p>
         </w:tc>
@@ -3296,7 +3224,7 @@
           </w:tcPr>
           <w:p>
             <w:r>
-              <w:t>Physical charging path restored; approx. 150 mV hysteresis; independent of discharge current</w:t>
+              <w:t>Physical charging path restored; bit set at approx. 1-1.5 A discharge; approx. 150 mV voltage hysteresis</w:t>
             </w:r>
           </w:p>
         </w:tc>

</xml_diff>

<commit_message>
fix(battery): restore strict MOSFET reset threshold
Restore the observed physical charge-MOSFET reset to the strict Vmax <3.45 V condition after the 3.6 V cutoff. Remove the previously added effective-discharge bit route so the report, metadata and publication site state one consistent voltage criterion.
</commit_message>
<xml_diff>
--- a/report/Dyness_BMS_Balancing_Algorithm_Charge_Control_Firmware_2.50-71.10.11.docx
+++ b/report/Dyness_BMS_Balancing_Algorithm_Charge_Control_Firmware_2.50-71.10.11.docx
@@ -118,7 +118,7 @@
     </w:p>
     <w:p>
       <w:r>
-        <w:t>This report documents observed Dyness BMS behaviour for firmware 2.50-71.10.11 in a Dyness PowerBrick Pro 14.3 kWh battery. The BMS uses a global current-qualified balancing gate and individual cell-voltage selection for passive balancing. At 3.5 V, the highest-cell condition produces SOC 100%, CCL 0 A and Charge Enabled false while the physical charge path remains closed; at 3.6 V, the physical charge MOSFET opens. After that cutoff, the observed physical reset has two routes: the highest cell falls below approximately 3.45 V, or the effective-discharge bit becomes set. In the tested system, that bit is set at approximately 1-1.5 A discharge current. These are measured observations and engineering interpretations, not a Dyness firmware specification. The report separates BMS communication state, balancing logic and physical protection behaviour.</w:t>
+        <w:t>This report documents observed Dyness BMS behaviour for firmware 2.50-71.10.11 in a Dyness PowerBrick Pro 14.3 kWh battery. The BMS uses a global current-qualified balancing gate and individual cell-voltage selection for passive balancing. At 3.5 V, the highest-cell condition produces SOC 100%, CCL 0 A and Charge Enabled false while the physical charge path remains closed; at 3.6 V, the physical charge MOSFET opens. After that cutoff, the observed physical reset criterion is strict: the highest cell must fall below approximately 3.45 V, giving approximately 150 mV voltage hysteresis. These are measured observations and engineering interpretations, not a Dyness firmware specification. The report separates BMS communication state, balancing logic and physical protection behaviour.</w:t>
       </w:r>
     </w:p>
     <w:p>
@@ -748,7 +748,7 @@
           </w:tcPr>
           <w:p>
             <w:r>
-              <w:t>Vmax &lt; 3.45 V or effective-discharge bit set</w:t>
+              <w:t>Strict Vmax &lt; 3.45 V after cutoff</w:t>
             </w:r>
           </w:p>
         </w:tc>
@@ -766,7 +766,7 @@
           </w:tcPr>
           <w:p>
             <w:r>
-              <w:t>Physical charging path restored; bit set at approx. 1-1.5 A discharge; approx. 150 mV voltage hysteresis</w:t>
+              <w:t>Physical charging path restored; approx. 150 mV voltage hysteresis</w:t>
             </w:r>
           </w:p>
         </w:tc>
@@ -987,7 +987,7 @@
         <w:spacing w:before="140"/>
       </w:pPr>
       <w:r>
-        <w:t>Key thresholds: 1.5 A / 1.4 A global current gate, approximately 60 mA per selected balancing cell or active channel, 30 mV individual-cell delta, 3.5 V full-detection threshold, 3.6 V hardware cutoff threshold, approximately 3.45 V voltage reset threshold and an effective-discharge bit reset route observed at approximately 1-1.5 A discharge current.</w:t>
+        <w:t>Key thresholds: 1.5 A / 1.4 A global current gate, approximately 60 mA per selected balancing cell or active channel, 30 mV individual-cell delta, 3.5 V full-detection threshold, 3.6 V hardware cutoff threshold and strict Vmax &lt; 3.45 V physical reset threshold with approximately 150 mV hysteresis.</w:t>
       </w:r>
     </w:p>
     <w:p>
@@ -1005,7 +1005,7 @@
     </w:p>
     <w:p>
       <w:r>
-        <w:t>The report uses a three-layer interpretation: (1) balancing eligibility and resistor selection, (2) communicated SOC/CCL/Charge Enabled state, and (3) physical charge-MOSFET protection. The physical reset after the 3.6 V cutoff has two observed routes: Vmax below approximately 3.45 V, giving approximately 150 mV voltage hysteresis, or the effective-discharge bit becoming set. In the tested system the bit is set at approximately 1-1.5 A discharge current. The bit condition and current are observed behaviour, not a manufacturer specification.</w:t>
+        <w:t>The report uses a three-layer interpretation: (1) balancing eligibility and resistor selection, (2) communicated SOC/CCL/Charge Enabled state, and (3) physical charge-MOSFET protection. The physical reset after the 3.6 V cutoff is strict: Vmax must fall below approximately 3.45 V, giving approximately 150 mV voltage hysteresis. This voltage condition is an observed system criterion, not a manufacturer specification.</w:t>
       </w:r>
     </w:p>
     <w:p>
@@ -1182,7 +1182,7 @@
         <w:jc w:val="center"/>
       </w:pPr>
       <w:r>
-        <w:t>Observed control-layer sequence: the physical charge path resets after the 3.6 V cutoff when Vmax &lt; 3.45 V or the effective-discharge bit is set. The bit is set at approximately 1-1.5 A discharge current.</w:t>
+        <w:t>Observed control-layer sequence: the physical charge path opens at the 3.6 V cutoff and resets only when Vmax falls strictly below approximately 3.45 V. The voltage reset route provides approximately 150 mV hysteresis.</w:t>
       </w:r>
     </w:p>
     <w:p>
@@ -1203,13 +1203,9 @@
         <w:br/>
         <w:t>Vmax = 3.6 V -&gt; charge MOSFET OFF -&gt; charging physically interrupted</w:t>
         <w:br/>
-        <w:t>Vmax &lt; 3.45 V OR effective discharge bit = SET</w:t>
+        <w:t>Vmax &lt; 3.45 V -&gt; charge MOSFET ON -&gt; physical charging path restored</w:t>
         <w:br/>
-        <w:t xml:space="preserve">                 -&gt; charge MOSFET ON -&gt; physical charging path restored</w:t>
-        <w:br/>
-        <w:t xml:space="preserve">                 voltage route: approximately 150 mV hysteresis</w:t>
-        <w:br/>
-        <w:t xml:space="preserve">                 effective-discharge bit set at approximately 1-1.5 A discharge</w:t>
+        <w:t xml:space="preserve">                 approximately 150 mV protection hysteresis</w:t>
       </w:r>
     </w:p>
     <w:p>
@@ -1670,7 +1666,7 @@
         <w:pStyle w:val="Heading2"/>
       </w:pPr>
       <w:r>
-        <w:t>10.1 Charge-MOSFET overvoltage cutoff and two physical reset routes</w:t>
+        <w:t>10.1 Charge-MOSFET overvoltage cutoff and physical reset</w:t>
       </w:r>
     </w:p>
     <w:p>
@@ -1690,7 +1686,7 @@
         <w:br/>
         <w:t>if Charge_MOSFET == OFF:</w:t>
         <w:br/>
-        <w:t xml:space="preserve">    if Vmax &lt; 3.45 V or effective_discharge_bit == SET:</w:t>
+        <w:t xml:space="preserve">    if Vmax &lt; 3.45 V:</w:t>
         <w:br/>
         <w:t xml:space="preserve">        Charge_MOSFET = ON</w:t>
         <w:br/>
@@ -1698,15 +1694,11 @@
         <w:br/>
         <w:t xml:space="preserve">        physical charging path = restored</w:t>
         <w:br/>
-        <w:br/>
-        <w:t># In the tested system the effective-discharge bit is set at</w:t>
-        <w:br/>
-        <w:t># approximately 1-1.5 A discharge current.</w:t>
       </w:r>
     </w:p>
     <w:p>
       <w:r>
-        <w:t>The physical protection path switches off at the observed 3.6 V maximum-cell cutoff. It can reset through two observed routes: the maximum cell falls below approximately 3.45 V, or the effective-discharge bit becomes set. The voltage route gives approximately 150 mV hysteresis. In the tested system the bit is set at approximately 1-1.5 A discharge current; this current and bit relationship are observed behaviour, not a manufacturer specification.</w:t>
+        <w:t>The physical protection path switches off at the observed 3.6 V maximum-cell cutoff. It resets only when the maximum cell falls strictly below approximately 3.45 V. The voltage route gives approximately 150 mV hysteresis. This is an observed system criterion, not a manufacturer specification.</w:t>
       </w:r>
     </w:p>
     <w:p>
@@ -1719,7 +1711,7 @@
     </w:p>
     <w:p>
       <w:r>
-        <w:t>Either reset route restores the physical charging path, but neither route should be conflated with CCL or Charge Enabled recovery. Those communication-layer values can remain at CCL 0 A / Charge Enabled false until the separate SOC transition from 100% to 99% is observed.</w:t>
+        <w:t>The voltage reset restores the physical charging path, but it should not be conflated with CCL or Charge Enabled recovery. Those communication-layer values can remain at CCL 0 A / Charge Enabled false until the separate SOC transition from 100% to 99% is observed.</w:t>
       </w:r>
     </w:p>
     <w:p>
@@ -2316,7 +2308,7 @@
           </w:tcPr>
           <w:p>
             <w:r>
-              <w:t>Vmax &lt; 3.45 V or effective-discharge bit set</w:t>
+              <w:t>Strict Vmax &lt; 3.45 V after cutoff</w:t>
             </w:r>
           </w:p>
         </w:tc>
@@ -2333,7 +2325,7 @@
           </w:tcPr>
           <w:p>
             <w:r>
-              <w:t>Physical charging path restored; bit set at approx. 1-1.5 A discharge; approx. 150 mV voltage hysteresis</w:t>
+              <w:t>Physical charging path restored; approx. 150 mV voltage hysteresis</w:t>
             </w:r>
           </w:p>
         </w:tc>
@@ -2447,15 +2439,13 @@
         <w:t xml:space="preserve">    Charge_MOSFET = OFF</w:t>
         <w:br/>
         <w:br/>
-        <w:t># Physical charge-MOSFET reset routes</w:t>
+        <w:t># Strict physical charge-MOSFET reset criterion</w:t>
         <w:br/>
-        <w:t>if Charge_MOSFET == OFF and (Vmax &lt; 3.45 V or effective_discharge_bit == SET):</w:t>
+        <w:t>if Charge_MOSFET == OFF and Vmax &lt; 3.45 V:</w:t>
         <w:br/>
         <w:t xml:space="preserve">    Charge_MOSFET = ON</w:t>
         <w:br/>
         <w:t xml:space="preserve">    physical charging path = restored</w:t>
-        <w:br/>
-        <w:t xml:space="preserve">    # The bit is observed set at approximately 1-1.5 A discharge</w:t>
         <w:br/>
         <w:br/>
         <w:t># Communication-layer restoration remains separate</w:t>
@@ -2486,12 +2476,12 @@
         <w:keepLines/>
       </w:pPr>
       <w:r>
-        <w:t>Physical charge-MOSFET reset after overvoltage cutoff: either Vmax falls below approximately 3.45 V, giving approximately 150 mV voltage hysteresis from the 3.6 V cutoff, or the observed effective-discharge bit becomes set. In the tested system the bit is set at approximately 1-1.5 A discharge current. The latter is a bit-triggered reset consequence, not a second voltage threshold.</w:t>
+        <w:t>Physical charge-MOSFET reset after overvoltage cutoff: strict Vmax &lt; 3.45 V, giving approximately 150 mV voltage hysteresis from the 3.6 V cutoff. This is the observed physical reset criterion.</w:t>
       </w:r>
     </w:p>
     <w:p>
       <w:r>
-        <w:t>The physical charging path is restored through either observed reset route: Vmax below approximately 3.45 V or the effective-discharge bit becoming set. This physical reset remains distinct from the later communication-layer CCL restoration at SOC 100% -&gt; 99%.</w:t>
+        <w:t>The physical charging path is restored only when Vmax falls strictly below approximately 3.45 V. This physical reset remains distinct from the later communication-layer CCL restoration at SOC 100% -&gt; 99%.</w:t>
       </w:r>
     </w:p>
     <w:p>
@@ -2536,7 +2526,7 @@
         <w:pStyle w:val="ListBullet"/>
       </w:pPr>
       <w:r>
-        <w:t>The effective-discharge bit route is an observed system behaviour inferred from correlated telemetry and physical charge-path recovery. The approximately 1-1.5 A current at which the bit becomes set is not presented as a manufacturer specification, exact firmware register definition or universal threshold. The voltage reset route remains an independent observed condition at Vmax below approximately 3.45 V.</w:t>
+        <w:t>The physical charge-MOSFET reset finding is limited to the observed strict Vmax &lt; 3.45 V condition after the 3.6 V cutoff, with approximately 150 mV hysteresis. It is not presented as a manufacturer specification or universal firmware threshold.</w:t>
       </w:r>
     </w:p>
     <w:p>
@@ -3206,7 +3196,7 @@
           </w:tcPr>
           <w:p>
             <w:r>
-              <w:t>Vmax &lt; 3.45 V or effective-discharge bit set</w:t>
+              <w:t>Strict Vmax &lt; 3.45 V after cutoff</w:t>
             </w:r>
           </w:p>
         </w:tc>
@@ -3224,7 +3214,7 @@
           </w:tcPr>
           <w:p>
             <w:r>
-              <w:t>Physical charging path restored; bit set at approx. 1-1.5 A discharge; approx. 150 mV voltage hysteresis</w:t>
+              <w:t>Physical charging path restored; approx. 150 mV voltage hysteresis</w:t>
             </w:r>
           </w:p>
         </w:tc>

</xml_diff>